<commit_message>
Resume: Systems Engineering Associate - MDM & Endpoint @ NTT DATA (MNC)
</commit_message>
<xml_diff>
--- a/resumes/Resume_Systems_Engineering_Associate_-_MDM_NTT_DATA__MNC_.docx
+++ b/resumes/Resume_Systems_Engineering_Associate_-_MDM_NTT_DATA__MNC_.docx
@@ -525,7 +525,7 @@
             <w:color w:val="000000"/>
             <w:u w:val="single"/>
           </w:rPr>
-          <w:t>Systems Engineering Associate - MDM &amp; Endpoint</w:t>
+          <w:t>SOC Automation and Threat Detection Lab</w:t>
         </w:r>
       </w:hyperlink>
       <w:r>
@@ -661,7 +661,7 @@
             <w:color w:val="000000"/>
             <w:u w:val="single"/>
           </w:rPr>
-          <w:t>Systems Engineering Associate - MDM &amp; Endpoint</w:t>
+          <w:t>Vulnerability Scanner and Patch Prioritization Engine</w:t>
         </w:r>
       </w:hyperlink>
       <w:r>
@@ -881,7 +881,7 @@
           <w:sz w:val="19"/>
           <w:szCs w:val="19"/>
         </w:rPr>
-        <w:t>Python, Bash (basic), regular expressions, Endpoint, Endpoint</w:t>
+        <w:t>Python, Bash (basic), regular expressions, Endpoint, Cloud</w:t>
       </w:r>
     </w:p>
     <w:p>

</xml_diff>